<commit_message>
Updated slides. Removing unnecessary slides
</commit_message>
<xml_diff>
--- a/Final Project/report/Executive Summary - Final Version (05.04.26).docx
+++ b/Final Project/report/Executive Summary - Final Version (05.04.26).docx
@@ -144,19 +144,7 @@
         <w:rPr>
           <w:color w:val="1A1A1A"/>
         </w:rPr>
-        <w:t xml:space="preserve"> Streaming serves 200,000 subscribers across three plan tiers, licenses 20,000 titles, and operates across 7 CDN regions and 10 ISP partners. </w:t>
-      </w:r>
-      <w:r>
-        <w:rPr>
-          <w:color w:val="1A1A1A"/>
-        </w:rPr>
-        <w:t>The business is operationally healthy. T</w:t>
-      </w:r>
-      <w:r>
-        <w:rPr>
-          <w:color w:val="1A1A1A"/>
-        </w:rPr>
-        <w:t xml:space="preserve">he data </w:t>
+        <w:t xml:space="preserve"> Streaming serves 200,000 subscribers across three plan tiers, licenses 20,000 titles, and operates across 7 CDN regions and 10 ISP partners. The business is operationally healthy. The data </w:t>
       </w:r>
       <w:r>
         <w:rPr>
@@ -731,13 +719,7 @@
         <w:rPr>
           <w:color w:val="1A1A1A"/>
         </w:rPr>
-        <w:t xml:space="preserve"> analytical needs split cleanly between historical batch reporting (which titles performed best last quarter? what drives churn?) and real-time monitoring (is buffering rate spiking right now?). Batch jobs run on a daily Airflow schedule; streaming jobs run continuously. Both write to the same HDFS analytics zone, allowing downstream consumers to query a unified dataset. We rejected Kappa because historical re-processing requires replaying the full ev</w:t>
-      </w:r>
-      <w:r>
-        <w:rPr>
-          <w:color w:val="1A1A1A"/>
-        </w:rPr>
-        <w:t xml:space="preserve">ent log, heavy aggregations are expensive in pure streaming, and analytics queries get more complex </w:t>
+        <w:t xml:space="preserve"> analytical needs split cleanly between historical batch reporting (which titles performed best last quarter? what drives churn?) and real-time monitoring (is buffering rate spiking right now?). Batch jobs run on a daily Airflow schedule; streaming jobs run continuously. Both write to the same HDFS analytics zone, allowing downstream consumers to query a unified dataset. We rejected Kappa because historical re-processing requires replaying the full event log, heavy aggregations are expensive in pure streaming, and analytics queries get more complex </w:t>
       </w:r>
       <w:r>
         <w:rPr>
@@ -866,13 +848,7 @@
         <w:rPr>
           <w:color w:val="1A1A1A"/>
         </w:rPr>
-        <w:t xml:space="preserve"> batch jobs read from landing, clean and standardize the data, write Parquet files to the curated zone, then perform joins and aggregations to produce three business-question-specific analytics tables. In parallel, a Kafka producer simulates real-time viewing events from the historical viewing-history dataset, and a Spark Structured Streaming consumer reads from the user-viewing-events topic to compute windowed aggregations such as top-watched con</w:t>
-      </w:r>
-      <w:r>
-        <w:rPr>
-          <w:color w:val="1A1A1A"/>
-        </w:rPr>
-        <w:t>tent per minute. Apache Airflow schedules and monitors the entire batch flow with built-in quality gates and retry logic.</w:t>
+        <w:t xml:space="preserve"> batch jobs read from landing, clean and standardize the data, write Parquet files to the curated zone, then perform joins and aggregations to produce three business-question-specific analytics tables. In parallel, a Kafka producer simulates real-time viewing events from the historical viewing-history dataset, and a Spark Structured Streaming consumer reads from the user-viewing-events topic to compute windowed aggregations such as top-watched content per minute. Apache Airflow schedules and monitors the entire batch flow with built-in quality gates and retry logic.</w:t>
       </w:r>
     </w:p>
     <w:p>
@@ -1759,13 +1735,7 @@
         <w:rPr>
           <w:color w:val="1A1A1A"/>
         </w:rPr>
-        <w:t>, forcing Rosetta emulation on M-series Macs. This added a small performance cost in exchange for removing image-availability friction across the team’s mix of Intel and Apple Silicon lap</w:t>
-      </w:r>
-      <w:r>
-        <w:rPr>
-          <w:color w:val="1A1A1A"/>
-        </w:rPr>
-        <w:t>tops.</w:t>
+        <w:t>, forcing Rosetta emulation on M-series Macs. This added a small performance cost in exchange for removing image-availability friction across the team’s mix of Intel and Apple Silicon laptops.</w:t>
       </w:r>
     </w:p>
     <w:p>
@@ -2050,13 +2020,7 @@
         <w:rPr>
           <w:color w:val="1A1A1A"/>
         </w:rPr>
-        <w:t xml:space="preserve"> values in user-interactions were replaced with a senti</w:t>
-      </w:r>
-      <w:r>
-        <w:rPr>
-          <w:color w:val="1A1A1A"/>
-        </w:rPr>
-        <w:t>nel string (</w:t>
+        <w:t xml:space="preserve"> values in user-interactions were replaced with a sentinel string (</w:t>
       </w:r>
       <w:r>
         <w:rPr>
@@ -2100,13 +2064,7 @@
         <w:rPr>
           <w:color w:val="1A1A1A"/>
         </w:rPr>
-        <w:t>The three joins required to produce enriched viewing sessions surfaced one notable design challenge: streaming-quality records do not share a session-level join key with viewing-history. Rather than fabricating one or dropping the quality data entirely, the script aggregates quality metrics to the user level (average buffering events, bitrate, resolution changes, latency per user) and joins at user granularity. This produces meaningful per-user quality context on every viewing session without requiring arti</w:t>
-      </w:r>
-      <w:r>
-        <w:rPr>
-          <w:color w:val="1A1A1A"/>
-        </w:rPr>
-        <w:t>ficial key construction.</w:t>
+        <w:t>The three joins required to produce enriched viewing sessions surfaced one notable design challenge: streaming-quality records do not share a session-level join key with viewing-history. Rather than fabricating one or dropping the quality data entirely, the script aggregates quality metrics to the user level (average buffering events, bitrate, resolution changes, latency per user) and joins at user granularity. This produces meaningful per-user quality context on every viewing session without requiring artificial key construction.</w:t>
       </w:r>
     </w:p>
     <w:p>
@@ -2303,13 +2261,7 @@
         <w:rPr>
           <w:color w:val="1A1A1A"/>
         </w:rPr>
-        <w:t>The Kafka producer replays events from the historical viewing-history dataset with simulated real-time timestamps, mimicking how the system would behave with live event traffic. Each event is serialized as JSON and includes the full viewing record. The Spark Structured Streaming consumer reads from the topic, applies a tumbling window aggregation, and emits per-window summaries such as concurrent active viewers and titles trending in the last interval. Output is written back to HDFS for downstream consumpti</w:t>
-      </w:r>
-      <w:r>
-        <w:rPr>
-          <w:color w:val="1A1A1A"/>
-        </w:rPr>
-        <w:t>on.</w:t>
+        <w:t>The Kafka producer replays events from the historical viewing-history dataset with simulated real-time timestamps, mimicking how the system would behave with live event traffic. Each event is serialized as JSON and includes the full viewing record. The Spark Structured Streaming consumer reads from the topic, applies a tumbling window aggregation, and emits per-window summaries such as concurrent active viewers and titles trending in the last interval. Output is written back to HDFS for downstream consumption.</w:t>
       </w:r>
     </w:p>
     <w:p>
@@ -2541,13 +2493,7 @@
         <w:rPr>
           <w:color w:val="1A1A1A"/>
         </w:rPr>
-        <w:t xml:space="preserve">The team’s data quality strategy operates at three points in the pipeline. First, Spark’s cleaning step rejects malformed rows at the boundary between landing and curated, ensuring downstream joins never encounter nulls in join keys. Second, Airflow’s quality gate task verifies that curated tables meet expected row count thresholds and have no nulls in required columns; failure here halts the DAG before bad data contaminates analytics outputs. Third, the streaming consumer’s checkpoint mechanism guarantees </w:t>
-      </w:r>
-      <w:r>
-        <w:rPr>
-          <w:color w:val="1A1A1A"/>
-        </w:rPr>
-        <w:t xml:space="preserve">that on restart, no events are processed </w:t>
+        <w:t xml:space="preserve">The team’s data quality strategy operates at three points in the pipeline. First, Spark’s cleaning step rejects malformed rows at the boundary between landing and curated, ensuring downstream joins never encounter nulls in join keys. Second, Airflow’s quality gate task verifies that curated tables meet expected row count thresholds and have no nulls in required columns; failure here halts the DAG before bad data contaminates analytics outputs. Third, the streaming consumer’s checkpoint mechanism guarantees that on restart, no events are processed </w:t>
       </w:r>
       <w:proofErr w:type="gramStart"/>
       <w:r>
@@ -5472,15 +5418,7 @@
           <w:iCs/>
           <w:color w:val="1A1A1A"/>
         </w:rPr>
-        <w:t>spark.sql.shu</w:t>
-      </w:r>
-      <w:r>
-        <w:rPr>
-          <w:i/>
-          <w:iCs/>
-          <w:color w:val="1A1A1A"/>
-        </w:rPr>
-        <w:t>ffle</w:t>
+        <w:t>spark.sql.shuffle</w:t>
       </w:r>
       <w:proofErr w:type="gramEnd"/>
       <w:r>
@@ -6891,13 +6829,7 @@
         <w:rPr>
           <w:color w:val="1A1A1A"/>
         </w:rPr>
-        <w:t xml:space="preserve"> at 100× scale, our recommendation is an AWS-based stack: S3 for storage (Parquet objects with lifecycle policies for cost control), EMR for Spark batch jobs (transient clusters terminating after each Airflow-triggered run), MSK for Kafka (managed multi-AZ broker cluster), and MWAA for orchestration. Estimated monthly cost at 100× scale: $4,000–6,000 for compute, $200–400 for storage (assuming Glacier transitions for landing zone after 90 days), and $300–500 for streaming. Including operational lab</w:t>
-      </w:r>
-      <w:r>
-        <w:rPr>
-          <w:color w:val="1A1A1A"/>
-        </w:rPr>
-        <w:t xml:space="preserve">or, this is approximately </w:t>
+        <w:t xml:space="preserve"> at 100× scale, our recommendation is an AWS-based stack: S3 for storage (Parquet objects with lifecycle policies for cost control), EMR for Spark batch jobs (transient clusters terminating after each Airflow-triggered run), MSK for Kafka (managed multi-AZ broker cluster), and MWAA for orchestration. Estimated monthly cost at 100× scale: $4,000–6,000 for compute, $200–400 for storage (assuming Glacier transitions for landing zone after 90 days), and $300–500 for streaming. Including operational labor, this is approximately </w:t>
       </w:r>
       <w:r>
         <w:rPr>
@@ -7030,13 +6962,7 @@
         <w:rPr>
           <w:color w:val="1A1A1A"/>
         </w:rPr>
-        <w:t xml:space="preserve"> partitions for catalog analytics, and 1-minute windows for buffering alerts with 15-minute windows for </w:t>
-      </w:r>
-      <w:r>
-        <w:rPr>
-          <w:color w:val="1A1A1A"/>
-        </w:rPr>
-        <w:t>content trends.</w:t>
+        <w:t xml:space="preserve"> partitions for catalog analytics, and 1-minute windows for buffering alerts with 15-minute windows for content trends.</w:t>
       </w:r>
     </w:p>
     <w:sectPr>
@@ -8125,4 +8051,10 @@
     </a:ext>
   </a:extLst>
 </a:theme>
+</file>
+
+<file path=docMetadata/LabelInfo.xml><?xml version="1.0" encoding="utf-8"?>
+<clbl:labelList xmlns:clbl="http://schemas.microsoft.com/office/2020/mipLabelMetadata">
+  <clbl:label id="{741bf7de-e2e5-46df-8d67-82607df9deaa}" enabled="0" method="" siteId="{741bf7de-e2e5-46df-8d67-82607df9deaa}" removed="1"/>
+</clbl:labelList>
 </file>
</xml_diff>

<commit_message>
Update final report Spark implementation details
</commit_message>
<xml_diff>
--- a/Final Project/report/Executive Summary - Final Version (05.04.26).docx
+++ b/Final Project/report/Executive Summary - Final Version (05.04.26).docx
@@ -750,6 +750,9 @@
         <w:jc w:val="center"/>
       </w:pPr>
       <w:r>
+        <w:rPr>
+          <w:noProof/>
+        </w:rPr>
         <w:drawing>
           <wp:inline distT="0" distB="0" distL="0" distR="0" wp14:anchorId="4A973515" wp14:editId="0352493E">
             <wp:extent cx="2923504" cy="1644471"/>
@@ -1163,91 +1166,13 @@
         <w:rPr>
           <w:color w:val="1A1A1A"/>
         </w:rPr>
-        <w:t xml:space="preserve"> holds cleaned, typed, and deduplicated versions of all five datasets, stored as Parquet. Cleaning includes null handling on required fields (e.g., </w:t>
-      </w:r>
-      <w:proofErr w:type="spellStart"/>
-      <w:r>
-        <w:rPr>
-          <w:color w:val="1A1A1A"/>
-        </w:rPr>
-        <w:t>user_id</w:t>
-      </w:r>
-      <w:proofErr w:type="spellEnd"/>
-      <w:r>
-        <w:rPr>
-          <w:color w:val="1A1A1A"/>
-        </w:rPr>
-        <w:t xml:space="preserve">, </w:t>
-      </w:r>
-      <w:proofErr w:type="spellStart"/>
-      <w:r>
-        <w:rPr>
-          <w:color w:val="1A1A1A"/>
-        </w:rPr>
-        <w:t>content_id</w:t>
-      </w:r>
-      <w:proofErr w:type="spellEnd"/>
-      <w:r>
-        <w:rPr>
-          <w:color w:val="1A1A1A"/>
-        </w:rPr>
-        <w:t xml:space="preserve">), type enforcement (timestamps cast to TimestampType, IDs to </w:t>
-      </w:r>
-      <w:proofErr w:type="spellStart"/>
-      <w:r>
-        <w:rPr>
-          <w:color w:val="1A1A1A"/>
-        </w:rPr>
-        <w:t>StringType</w:t>
-      </w:r>
-      <w:proofErr w:type="spellEnd"/>
-      <w:r>
-        <w:rPr>
-          <w:color w:val="1A1A1A"/>
-        </w:rPr>
-        <w:t>), value clamping (</w:t>
-      </w:r>
-      <w:proofErr w:type="spellStart"/>
-      <w:r>
-        <w:rPr>
-          <w:color w:val="1A1A1A"/>
-        </w:rPr>
-        <w:t>completion_pct</w:t>
-      </w:r>
-      <w:proofErr w:type="spellEnd"/>
-      <w:r>
-        <w:rPr>
-          <w:color w:val="1A1A1A"/>
-        </w:rPr>
-        <w:t xml:space="preserve"> constrained to [0,100]; </w:t>
-      </w:r>
-      <w:proofErr w:type="spellStart"/>
-      <w:r>
-        <w:rPr>
-          <w:color w:val="1A1A1A"/>
-        </w:rPr>
-        <w:t>duration_watched_min</w:t>
-      </w:r>
-      <w:proofErr w:type="spellEnd"/>
-      <w:r>
-        <w:rPr>
-          <w:color w:val="1A1A1A"/>
-        </w:rPr>
-        <w:t xml:space="preserve"> capped at </w:t>
-      </w:r>
-      <w:proofErr w:type="spellStart"/>
-      <w:r>
-        <w:rPr>
-          <w:color w:val="1A1A1A"/>
-        </w:rPr>
-        <w:t>total_duration_min</w:t>
-      </w:r>
-      <w:proofErr w:type="spellEnd"/>
-      <w:r>
-        <w:rPr>
-          <w:color w:val="1A1A1A"/>
-        </w:rPr>
-        <w:t>), and standardization of free-text categorical fields. Each curated table is overwritten on each pipeline run, ensuring idempotency.</w:t>
+        <w:t xml:space="preserve"> holds cleaned reusable Parquet datasets derived from the landing files. In the implemented Stage 2 pipeline, viewing-history and user-interactions are cleaned directly, while content-catalog, user-profiles, and streaming-quality are incorporated into an enriched viewing-sessions table. This design keeps the curated layer focused on reusable business entities rather than creating one curated table for every raw input file</w:t>
+      </w:r>
+      <w:r>
+        <w:rPr>
+          <w:color w:val="1A1A1A"/>
+        </w:rPr>
+        <w:t>.</w:t>
       </w:r>
     </w:p>
     <w:p>
@@ -2811,12 +2736,6 @@
         <w:gridCol w:w="4500"/>
       </w:tblGrid>
       <w:tr>
-        <w:tblPrEx>
-          <w:tblCellMar>
-            <w:top w:w="0" w:type="dxa"/>
-            <w:bottom w:w="0" w:type="dxa"/>
-          </w:tblCellMar>
-        </w:tblPrEx>
         <w:tc>
           <w:tcPr>
             <w:tcW w:w="4500" w:type="dxa"/>
@@ -2885,12 +2804,6 @@
         </w:tc>
       </w:tr>
       <w:tr>
-        <w:tblPrEx>
-          <w:tblCellMar>
-            <w:top w:w="0" w:type="dxa"/>
-            <w:bottom w:w="0" w:type="dxa"/>
-          </w:tblCellMar>
-        </w:tblPrEx>
         <w:tc>
           <w:tcPr>
             <w:tcW w:w="4500" w:type="dxa"/>
@@ -2999,12 +2912,6 @@
         </w:tc>
       </w:tr>
       <w:tr>
-        <w:tblPrEx>
-          <w:tblCellMar>
-            <w:top w:w="0" w:type="dxa"/>
-            <w:bottom w:w="0" w:type="dxa"/>
-          </w:tblCellMar>
-        </w:tblPrEx>
         <w:tc>
           <w:tcPr>
             <w:tcW w:w="4500" w:type="dxa"/>
@@ -3113,12 +3020,6 @@
         </w:tc>
       </w:tr>
       <w:tr>
-        <w:tblPrEx>
-          <w:tblCellMar>
-            <w:top w:w="0" w:type="dxa"/>
-            <w:bottom w:w="0" w:type="dxa"/>
-          </w:tblCellMar>
-        </w:tblPrEx>
         <w:tc>
           <w:tcPr>
             <w:tcW w:w="4500" w:type="dxa"/>
@@ -3227,12 +3128,6 @@
         </w:tc>
       </w:tr>
       <w:tr>
-        <w:tblPrEx>
-          <w:tblCellMar>
-            <w:top w:w="0" w:type="dxa"/>
-            <w:bottom w:w="0" w:type="dxa"/>
-          </w:tblCellMar>
-        </w:tblPrEx>
         <w:tc>
           <w:tcPr>
             <w:tcW w:w="4500" w:type="dxa"/>
@@ -3341,12 +3236,6 @@
         </w:tc>
       </w:tr>
       <w:tr>
-        <w:tblPrEx>
-          <w:tblCellMar>
-            <w:top w:w="0" w:type="dxa"/>
-            <w:bottom w:w="0" w:type="dxa"/>
-          </w:tblCellMar>
-        </w:tblPrEx>
         <w:tc>
           <w:tcPr>
             <w:tcW w:w="4500" w:type="dxa"/>
@@ -3831,12 +3720,6 @@
         <w:gridCol w:w="2000"/>
       </w:tblGrid>
       <w:tr>
-        <w:tblPrEx>
-          <w:tblCellMar>
-            <w:top w:w="0" w:type="dxa"/>
-            <w:bottom w:w="0" w:type="dxa"/>
-          </w:tblCellMar>
-        </w:tblPrEx>
         <w:tc>
           <w:tcPr>
             <w:tcW w:w="3000" w:type="dxa"/>
@@ -3968,12 +3851,6 @@
         </w:tc>
       </w:tr>
       <w:tr>
-        <w:tblPrEx>
-          <w:tblCellMar>
-            <w:top w:w="0" w:type="dxa"/>
-            <w:bottom w:w="0" w:type="dxa"/>
-          </w:tblCellMar>
-        </w:tblPrEx>
         <w:tc>
           <w:tcPr>
             <w:tcW w:w="3000" w:type="dxa"/>
@@ -4115,12 +3992,6 @@
         </w:tc>
       </w:tr>
       <w:tr>
-        <w:tblPrEx>
-          <w:tblCellMar>
-            <w:top w:w="0" w:type="dxa"/>
-            <w:bottom w:w="0" w:type="dxa"/>
-          </w:tblCellMar>
-        </w:tblPrEx>
         <w:tc>
           <w:tcPr>
             <w:tcW w:w="3000" w:type="dxa"/>
@@ -4241,12 +4112,6 @@
         </w:tc>
       </w:tr>
       <w:tr>
-        <w:tblPrEx>
-          <w:tblCellMar>
-            <w:top w:w="0" w:type="dxa"/>
-            <w:bottom w:w="0" w:type="dxa"/>
-          </w:tblCellMar>
-        </w:tblPrEx>
         <w:tc>
           <w:tcPr>
             <w:tcW w:w="3000" w:type="dxa"/>
@@ -4366,12 +4231,6 @@
         </w:tc>
       </w:tr>
       <w:tr>
-        <w:tblPrEx>
-          <w:tblCellMar>
-            <w:top w:w="0" w:type="dxa"/>
-            <w:bottom w:w="0" w:type="dxa"/>
-          </w:tblCellMar>
-        </w:tblPrEx>
         <w:tc>
           <w:tcPr>
             <w:tcW w:w="3000" w:type="dxa"/>
@@ -4788,12 +4647,6 @@
         <w:gridCol w:w="3000"/>
       </w:tblGrid>
       <w:tr>
-        <w:tblPrEx>
-          <w:tblCellMar>
-            <w:top w:w="0" w:type="dxa"/>
-            <w:bottom w:w="0" w:type="dxa"/>
-          </w:tblCellMar>
-        </w:tblPrEx>
         <w:tc>
           <w:tcPr>
             <w:tcW w:w="800" w:type="dxa"/>
@@ -4922,12 +4775,6 @@
         </w:tc>
       </w:tr>
       <w:tr>
-        <w:tblPrEx>
-          <w:tblCellMar>
-            <w:top w:w="0" w:type="dxa"/>
-            <w:bottom w:w="0" w:type="dxa"/>
-          </w:tblCellMar>
-        </w:tblPrEx>
         <w:tc>
           <w:tcPr>
             <w:tcW w:w="800" w:type="dxa"/>
@@ -5066,12 +4913,6 @@
         </w:tc>
       </w:tr>
       <w:tr>
-        <w:tblPrEx>
-          <w:tblCellMar>
-            <w:top w:w="0" w:type="dxa"/>
-            <w:bottom w:w="0" w:type="dxa"/>
-          </w:tblCellMar>
-        </w:tblPrEx>
         <w:tc>
           <w:tcPr>
             <w:tcW w:w="800" w:type="dxa"/>
@@ -5190,12 +5031,6 @@
         </w:tc>
       </w:tr>
       <w:tr>
-        <w:tblPrEx>
-          <w:tblCellMar>
-            <w:top w:w="0" w:type="dxa"/>
-            <w:bottom w:w="0" w:type="dxa"/>
-          </w:tblCellMar>
-        </w:tblPrEx>
         <w:tc>
           <w:tcPr>
             <w:tcW w:w="800" w:type="dxa"/>
@@ -5687,12 +5522,6 @@
         <w:gridCol w:w="1500"/>
       </w:tblGrid>
       <w:tr>
-        <w:tblPrEx>
-          <w:tblCellMar>
-            <w:top w:w="0" w:type="dxa"/>
-            <w:bottom w:w="0" w:type="dxa"/>
-          </w:tblCellMar>
-        </w:tblPrEx>
         <w:tc>
           <w:tcPr>
             <w:tcW w:w="2200" w:type="dxa"/>
@@ -5855,12 +5684,6 @@
         </w:tc>
       </w:tr>
       <w:tr>
-        <w:tblPrEx>
-          <w:tblCellMar>
-            <w:top w:w="0" w:type="dxa"/>
-            <w:bottom w:w="0" w:type="dxa"/>
-          </w:tblCellMar>
-        </w:tblPrEx>
         <w:tc>
           <w:tcPr>
             <w:tcW w:w="2200" w:type="dxa"/>
@@ -6009,12 +5832,6 @@
         </w:tc>
       </w:tr>
       <w:tr>
-        <w:tblPrEx>
-          <w:tblCellMar>
-            <w:top w:w="0" w:type="dxa"/>
-            <w:bottom w:w="0" w:type="dxa"/>
-          </w:tblCellMar>
-        </w:tblPrEx>
         <w:tc>
           <w:tcPr>
             <w:tcW w:w="2200" w:type="dxa"/>
@@ -6165,12 +5982,6 @@
         </w:tc>
       </w:tr>
       <w:tr>
-        <w:tblPrEx>
-          <w:tblCellMar>
-            <w:top w:w="0" w:type="dxa"/>
-            <w:bottom w:w="0" w:type="dxa"/>
-          </w:tblCellMar>
-        </w:tblPrEx>
         <w:tc>
           <w:tcPr>
             <w:tcW w:w="2200" w:type="dxa"/>
@@ -6319,12 +6130,6 @@
         </w:tc>
       </w:tr>
       <w:tr>
-        <w:tblPrEx>
-          <w:tblCellMar>
-            <w:top w:w="0" w:type="dxa"/>
-            <w:bottom w:w="0" w:type="dxa"/>
-          </w:tblCellMar>
-        </w:tblPrEx>
         <w:tc>
           <w:tcPr>
             <w:tcW w:w="2200" w:type="dxa"/>
@@ -6473,12 +6278,6 @@
         </w:tc>
       </w:tr>
       <w:tr>
-        <w:tblPrEx>
-          <w:tblCellMar>
-            <w:top w:w="0" w:type="dxa"/>
-            <w:bottom w:w="0" w:type="dxa"/>
-          </w:tblCellMar>
-        </w:tblPrEx>
         <w:tc>
           <w:tcPr>
             <w:tcW w:w="2200" w:type="dxa"/>
@@ -6645,12 +6444,6 @@
         </w:tc>
       </w:tr>
       <w:tr>
-        <w:tblPrEx>
-          <w:tblCellMar>
-            <w:top w:w="0" w:type="dxa"/>
-            <w:bottom w:w="0" w:type="dxa"/>
-          </w:tblCellMar>
-        </w:tblPrEx>
         <w:tc>
           <w:tcPr>
             <w:tcW w:w="2200" w:type="dxa"/>
@@ -7137,7 +6930,7 @@
   <w:docDefaults>
     <w:rPrDefault>
       <w:rPr>
-        <w:rFonts w:ascii="Calibri" w:eastAsia="Calibri" w:hAnsi="Calibri" w:cs="Calibri"/>
+        <w:rFonts w:ascii="Calibri" w:eastAsiaTheme="minorEastAsia" w:hAnsi="Calibri" w:cs="Calibri"/>
         <w:sz w:val="22"/>
         <w:szCs w:val="22"/>
         <w:lang w:val="en-US" w:eastAsia="en-US" w:bidi="ar-SA"/>
@@ -7620,6 +7413,7 @@
   <w:style w:type="character" w:default="1" w:styleId="DefaultParagraphFont">
     <w:name w:val="Default Paragraph Font"/>
     <w:uiPriority w:val="1"/>
+    <w:semiHidden/>
     <w:unhideWhenUsed/>
   </w:style>
   <w:style w:type="table" w:default="1" w:styleId="TableNormal">
@@ -8051,10 +7845,4 @@
     </a:ext>
   </a:extLst>
 </a:theme>
-</file>
-
-<file path=docMetadata/LabelInfo.xml><?xml version="1.0" encoding="utf-8"?>
-<clbl:labelList xmlns:clbl="http://schemas.microsoft.com/office/2020/mipLabelMetadata">
-  <clbl:label id="{741bf7de-e2e5-46df-8d67-82607df9deaa}" enabled="0" method="" siteId="{741bf7de-e2e5-46df-8d67-82607df9deaa}" removed="1"/>
-</clbl:labelList>
 </file>
</xml_diff>